<commit_message>
P10: async await dan penanganan galat
</commit_message>
<xml_diff>
--- a/worksheet-p10/WORKSHEET-P10.docx
+++ b/worksheet-p10/WORKSHEET-P10.docx
@@ -5599,14 +5599,8 @@
         <w:tc>
           <w:tcPr/>
           <w:p>
-            <w:pPr>
-              <w:spacing w:after="0" w:before="0" w:lineRule="auto"/>
-              <w:rPr/>
-            </w:pPr>
-            <w:r>
-              <w:rPr>
-                <w:rtl w:val="0"/>
-              </w:rPr>
+            <w:r>
+              <w:t>Muncul: 'Gagal memuat catatan: status 404'.</w:t>
             </w:r>
           </w:p>
         </w:tc>
@@ -5671,14 +5665,8 @@
         <w:tc>
           <w:tcPr/>
           <w:p>
-            <w:pPr>
-              <w:spacing w:after="0" w:before="0" w:lineRule="auto"/>
-              <w:rPr/>
-            </w:pPr>
-            <w:r>
-              <w:rPr>
-                <w:rtl w:val="0"/>
-              </w:rPr>
+            <w:r>
+              <w:t>Domain .invalid: 'Failed to fetch' tampil. Mode Offline memutus halaman lokal saat reload.</w:t>
             </w:r>
           </w:p>
         </w:tc>
@@ -5743,14 +5731,8 @@
         <w:tc>
           <w:tcPr/>
           <w:p>
-            <w:pPr>
-              <w:spacing w:after="0" w:before="0" w:lineRule="auto"/>
-              <w:rPr/>
-            </w:pPr>
-            <w:r>
-              <w:rPr>
-                <w:rtl w:val="0"/>
-              </w:rPr>
+            <w:r>
+              <w:t>URL asli: 4 catatan kembali.</w:t>
             </w:r>
           </w:p>
         </w:tc>

</xml_diff>

<commit_message>
P10: membaca JSON dua arah
</commit_message>
<xml_diff>
--- a/worksheet-p10/WORKSHEET-P10.docx
+++ b/worksheet-p10/WORKSHEET-P10.docx
@@ -7242,66 +7242,24 @@
         <w:tc>
           <w:tcPr/>
           <w:p>
-            <w:pPr>
-              <w:spacing w:after="0" w:before="0" w:lineRule="auto"/>
-              <w:rPr/>
-            </w:pPr>
-            <w:r>
-              <w:rPr>
-                <w:rtl w:val="0"/>
-              </w:rPr>
-            </w:r>
-          </w:p>
-        </w:tc>
-        <w:tc>
-          <w:tcPr/>
-          <w:p>
-            <w:pPr>
-              <w:spacing w:after="0" w:before="0" w:lineRule="auto"/>
-              <w:rPr/>
-            </w:pPr>
-            <w:r>
-              <w:rPr>
-                <w:rFonts w:ascii="Carlito" w:cs="Carlito" w:eastAsia="Carlito" w:hAnsi="Carlito"/>
-                <w:b w:val="0"/>
-                <w:bCs w:val="0"/>
-                <w:color w:val="1a1a2e"/>
-                <w:sz w:val="18"/>
-                <w:szCs w:val="18"/>
-                <w:rtl w:val="0"/>
-              </w:rPr>
-              <w:t xml:space="preserve">object</w:t>
-            </w:r>
-            <w:r>
-              <w:rPr>
-                <w:rtl w:val="0"/>
-              </w:rPr>
-            </w:r>
-          </w:p>
-        </w:tc>
-        <w:tc>
-          <w:tcPr/>
-          <w:p>
-            <w:pPr>
-              <w:spacing w:after="0" w:before="0" w:lineRule="auto"/>
-              <w:rPr/>
-            </w:pPr>
-            <w:r>
-              <w:rPr>
-                <w:rFonts w:ascii="Carlito" w:cs="Carlito" w:eastAsia="Carlito" w:hAnsi="Carlito"/>
-                <w:b w:val="0"/>
-                <w:bCs w:val="0"/>
-                <w:color w:val="1a1a2e"/>
-                <w:sz w:val="18"/>
-                <w:szCs w:val="18"/>
-                <w:rtl w:val="0"/>
-              </w:rPr>
-              <w:t xml:space="preserve">data.____</w:t>
-            </w:r>
-            <w:r>
-              <w:rPr>
-                <w:rtl w:val="0"/>
-              </w:rPr>
+            <w:r>
+              <w:t>data[0] (elemen array)</w:t>
+            </w:r>
+          </w:p>
+        </w:tc>
+        <w:tc>
+          <w:tcPr/>
+          <w:p>
+            <w:r>
+              <w:t>object: {userId: 1, id: 1, title: ..., body: ...}</w:t>
+            </w:r>
+          </w:p>
+        </w:tc>
+        <w:tc>
+          <w:tcPr/>
+          <w:p>
+            <w:r>
+              <w:t>data[0].title</w:t>
             </w:r>
           </w:p>
         </w:tc>
@@ -7314,66 +7272,24 @@
         <w:tc>
           <w:tcPr/>
           <w:p>
-            <w:pPr>
-              <w:spacing w:after="0" w:before="0" w:lineRule="auto"/>
-              <w:rPr/>
-            </w:pPr>
-            <w:r>
-              <w:rPr>
-                <w:rtl w:val="0"/>
-              </w:rPr>
-            </w:r>
-          </w:p>
-        </w:tc>
-        <w:tc>
-          <w:tcPr/>
-          <w:p>
-            <w:pPr>
-              <w:spacing w:after="0" w:before="0" w:lineRule="auto"/>
-              <w:rPr/>
-            </w:pPr>
-            <w:r>
-              <w:rPr>
-                <w:rFonts w:ascii="Carlito" w:cs="Carlito" w:eastAsia="Carlito" w:hAnsi="Carlito"/>
-                <w:b w:val="0"/>
-                <w:bCs w:val="0"/>
-                <w:color w:val="1a1a2e"/>
-                <w:sz w:val="18"/>
-                <w:szCs w:val="18"/>
-                <w:rtl w:val="0"/>
-              </w:rPr>
-              <w:t xml:space="preserve">array</w:t>
-            </w:r>
-            <w:r>
-              <w:rPr>
-                <w:rtl w:val="0"/>
-              </w:rPr>
-            </w:r>
-          </w:p>
-        </w:tc>
-        <w:tc>
-          <w:tcPr/>
-          <w:p>
-            <w:pPr>
-              <w:spacing w:after="0" w:before="0" w:lineRule="auto"/>
-              <w:rPr/>
-            </w:pPr>
-            <w:r>
-              <w:rPr>
-                <w:rFonts w:ascii="Carlito" w:cs="Carlito" w:eastAsia="Carlito" w:hAnsi="Carlito"/>
-                <w:b w:val="0"/>
-                <w:bCs w:val="0"/>
-                <w:color w:val="1a1a2e"/>
-                <w:sz w:val="18"/>
-                <w:szCs w:val="18"/>
-                <w:rtl w:val="0"/>
-              </w:rPr>
-              <w:t xml:space="preserve">data.____.forEach(____)</w:t>
-            </w:r>
-            <w:r>
-              <w:rPr>
-                <w:rtl w:val="0"/>
-              </w:rPr>
+            <w:r>
+              <w:t>data (akar respons)</w:t>
+            </w:r>
+          </w:p>
+        </w:tc>
+        <w:tc>
+          <w:tcPr/>
+          <w:p>
+            <w:r>
+              <w:t>array: 4 objek post</w:t>
+            </w:r>
+          </w:p>
+        </w:tc>
+        <w:tc>
+          <w:tcPr/>
+          <w:p>
+            <w:r>
+              <w:t>data.forEach((post) =&gt; console.log(post.title))</w:t>
             </w:r>
           </w:p>
         </w:tc>
@@ -7386,66 +7302,24 @@
         <w:tc>
           <w:tcPr/>
           <w:p>
-            <w:pPr>
-              <w:spacing w:after="0" w:before="0" w:lineRule="auto"/>
-              <w:rPr/>
-            </w:pPr>
-            <w:r>
-              <w:rPr>
-                <w:rtl w:val="0"/>
-              </w:rPr>
-            </w:r>
-          </w:p>
-        </w:tc>
-        <w:tc>
-          <w:tcPr/>
-          <w:p>
-            <w:pPr>
-              <w:spacing w:after="0" w:before="0" w:lineRule="auto"/>
-              <w:rPr/>
-            </w:pPr>
-            <w:r>
-              <w:rPr>
-                <w:rFonts w:ascii="Carlito" w:cs="Carlito" w:eastAsia="Carlito" w:hAnsi="Carlito"/>
-                <w:b w:val="0"/>
-                <w:bCs w:val="0"/>
-                <w:color w:val="1a1a2e"/>
-                <w:sz w:val="18"/>
-                <w:szCs w:val="18"/>
-                <w:rtl w:val="0"/>
-              </w:rPr>
-              <w:t xml:space="preserve">text or number</w:t>
-            </w:r>
-            <w:r>
-              <w:rPr>
-                <w:rtl w:val="0"/>
-              </w:rPr>
-            </w:r>
-          </w:p>
-        </w:tc>
-        <w:tc>
-          <w:tcPr/>
-          <w:p>
-            <w:pPr>
-              <w:spacing w:after="0" w:before="0" w:lineRule="auto"/>
-              <w:rPr/>
-            </w:pPr>
-            <w:r>
-              <w:rPr>
-                <w:rFonts w:ascii="Carlito" w:cs="Carlito" w:eastAsia="Carlito" w:hAnsi="Carlito"/>
-                <w:b w:val="0"/>
-                <w:bCs w:val="0"/>
-                <w:color w:val="1a1a2e"/>
-                <w:sz w:val="18"/>
-                <w:szCs w:val="18"/>
-                <w:rtl w:val="0"/>
-              </w:rPr>
-              <w:t xml:space="preserve">data.____</w:t>
-            </w:r>
-            <w:r>
-              <w:rPr>
-                <w:rtl w:val="0"/>
-              </w:rPr>
+            <w:r>
+              <w:t>userId, id, title, body</w:t>
+            </w:r>
+          </w:p>
+        </w:tc>
+        <w:tc>
+          <w:tcPr/>
+          <w:p>
+            <w:r>
+              <w:t>number: 1; string: judul dan isi</w:t>
+            </w:r>
+          </w:p>
+        </w:tc>
+        <w:tc>
+          <w:tcPr/>
+          <w:p>
+            <w:r>
+              <w:t>data[0].id; data[0].title</w:t>
             </w:r>
           </w:p>
         </w:tc>
@@ -7458,66 +7332,24 @@
         <w:tc>
           <w:tcPr/>
           <w:p>
-            <w:pPr>
-              <w:spacing w:after="0" w:before="0" w:lineRule="auto"/>
-              <w:rPr/>
-            </w:pPr>
-            <w:r>
-              <w:rPr>
-                <w:rtl w:val="0"/>
-              </w:rPr>
-            </w:r>
-          </w:p>
-        </w:tc>
-        <w:tc>
-          <w:tcPr/>
-          <w:p>
-            <w:pPr>
-              <w:spacing w:after="0" w:before="0" w:lineRule="auto"/>
-              <w:rPr/>
-            </w:pPr>
-            <w:r>
-              <w:rPr>
-                <w:rFonts w:ascii="Carlito" w:cs="Carlito" w:eastAsia="Carlito" w:hAnsi="Carlito"/>
-                <w:b w:val="0"/>
-                <w:bCs w:val="0"/>
-                <w:color w:val="1a1a2e"/>
-                <w:sz w:val="18"/>
-                <w:szCs w:val="18"/>
-                <w:rtl w:val="0"/>
-              </w:rPr>
-              <w:t xml:space="preserve">true or false, or null</w:t>
-            </w:r>
-            <w:r>
-              <w:rPr>
-                <w:rtl w:val="0"/>
-              </w:rPr>
-            </w:r>
-          </w:p>
-        </w:tc>
-        <w:tc>
-          <w:tcPr/>
-          <w:p>
-            <w:pPr>
-              <w:spacing w:after="0" w:before="0" w:lineRule="auto"/>
-              <w:rPr/>
-            </w:pPr>
-            <w:r>
-              <w:rPr>
-                <w:rFonts w:ascii="Carlito" w:cs="Carlito" w:eastAsia="Carlito" w:hAnsi="Carlito"/>
-                <w:b w:val="0"/>
-                <w:bCs w:val="0"/>
-                <w:color w:val="1a1a2e"/>
-                <w:sz w:val="18"/>
-                <w:szCs w:val="18"/>
-                <w:rtl w:val="0"/>
-              </w:rPr>
-              <w:t xml:space="preserve">data.____</w:t>
-            </w:r>
-            <w:r>
-              <w:rPr>
-                <w:rtl w:val="0"/>
-              </w:rPr>
+            <w:r>
+              <w:t>Tidak ada</w:t>
+            </w:r>
+          </w:p>
+        </w:tc>
+        <w:tc>
+          <w:tcPr/>
+          <w:p>
+            <w:r>
+              <w:t>boolean atau null tidak ada pada respons ini</w:t>
+            </w:r>
+          </w:p>
+        </w:tc>
+        <w:tc>
+          <w:tcPr/>
+          <w:p>
+            <w:r>
+              <w:t>Tidak berlaku; jangan menebak key</w:t>
             </w:r>
           </w:p>
         </w:tc>

</xml_diff>

<commit_message>
P10: tampilkan data API dan empat keadaan
</commit_message>
<xml_diff>
--- a/worksheet-p10/WORKSHEET-P10.docx
+++ b/worksheet-p10/WORKSHEET-P10.docx
@@ -8595,14 +8595,8 @@
         <w:tc>
           <w:tcPr/>
           <w:p>
-            <w:pPr>
-              <w:spacing w:after="0" w:before="0" w:lineRule="auto"/>
-              <w:rPr/>
-            </w:pPr>
-            <w:r>
-              <w:rPr>
-                <w:rtl w:val="0"/>
-              </w:rPr>
+            <w:r>
+              <w:t>Memuat data; Coba lagi nonaktif.</w:t>
             </w:r>
           </w:p>
         </w:tc>
@@ -8667,14 +8661,8 @@
         <w:tc>
           <w:tcPr/>
           <w:p>
-            <w:pPr>
-              <w:spacing w:after="0" w:before="0" w:lineRule="auto"/>
-              <w:rPr/>
-            </w:pPr>
-            <w:r>
-              <w:rPr>
-                <w:rtl w:val="0"/>
-              </w:rPr>
+            <w:r>
+              <w:t>4 artikel dan status berhasil.</w:t>
             </w:r>
           </w:p>
         </w:tc>
@@ -8739,14 +8727,8 @@
         <w:tc>
           <w:tcPr/>
           <w:p>
-            <w:pPr>
-              <w:spacing w:after="0" w:before="0" w:lineRule="auto"/>
-              <w:rPr/>
-            </w:pPr>
-            <w:r>
-              <w:rPr>
-                <w:rtl w:val="0"/>
-              </w:rPr>
+            <w:r>
+              <w:t>Gagal memuat: Failed to fetch.</w:t>
             </w:r>
           </w:p>
         </w:tc>
@@ -8811,14 +8793,8 @@
         <w:tc>
           <w:tcPr/>
           <w:p>
-            <w:pPr>
-              <w:spacing w:after="0" w:before="0" w:lineRule="auto"/>
-              <w:rPr/>
-            </w:pPr>
-            <w:r>
-              <w:rPr>
-                <w:rtl w:val="0"/>
-              </w:rPr>
+            <w:r>
+              <w:t>Belum ada catatan dari API.</w:t>
             </w:r>
           </w:p>
         </w:tc>
@@ -9038,14 +9014,8 @@
         <w:tc>
           <w:tcPr/>
           <w:p>
-            <w:pPr>
-              <w:spacing w:after="0" w:before="0" w:lineRule="auto"/>
-              <w:rPr/>
-            </w:pPr>
-            <w:r>
-              <w:rPr>
-                <w:rtl w:val="0"/>
-              </w:rPr>
+            <w:r>
+              <w:t>fetchNews() diekspor.</w:t>
             </w:r>
           </w:p>
         </w:tc>
@@ -9110,14 +9080,8 @@
         <w:tc>
           <w:tcPr/>
           <w:p>
-            <w:pPr>
-              <w:spacing w:after="0" w:before="0" w:lineRule="auto"/>
-              <w:rPr/>
-            </w:pPr>
-            <w:r>
-              <w:rPr>
-                <w:rtl w:val="0"/>
-              </w:rPr>
+            <w:r>
+              <w:t>fetch hanya di api.js.</w:t>
             </w:r>
           </w:p>
         </w:tc>
@@ -9182,14 +9146,8 @@
         <w:tc>
           <w:tcPr/>
           <w:p>
-            <w:pPr>
-              <w:spacing w:after="0" w:before="0" w:lineRule="auto"/>
-              <w:rPr/>
-            </w:pPr>
-            <w:r>
-              <w:rPr>
-                <w:rtl w:val="0"/>
-              </w:rPr>
+            <w:r>
+              <w:t>try/catch di muatStatusApi().</w:t>
             </w:r>
           </w:p>
         </w:tc>
@@ -9254,14 +9212,8 @@
         <w:tc>
           <w:tcPr/>
           <w:p>
-            <w:pPr>
-              <w:spacing w:after="0" w:before="0" w:lineRule="auto"/>
-              <w:rPr/>
-            </w:pPr>
-            <w:r>
-              <w:rPr>
-                <w:rtl w:val="0"/>
-              </w:rPr>
+            <w:r>
+              <w:t>Coba lagi tetap 4 artikel.</w:t>
             </w:r>
           </w:p>
         </w:tc>
@@ -9326,14 +9278,8 @@
         <w:tc>
           <w:tcPr/>
           <w:p>
-            <w:pPr>
-              <w:spacing w:after="0" w:before="0" w:lineRule="auto"/>
-              <w:rPr/>
-            </w:pPr>
-            <w:r>
-              <w:rPr>
-                <w:rtl w:val="0"/>
-              </w:rPr>
+            <w:r>
+              <w:t>Ekspor: fetchNews.</w:t>
             </w:r>
           </w:p>
         </w:tc>

</xml_diff>

<commit_message>
P10: tangani kasus 404 dan respons bukan JSON
</commit_message>
<xml_diff>
--- a/worksheet-p10/WORKSHEET-P10.docx
+++ b/worksheet-p10/WORKSHEET-P10.docx
@@ -10756,42 +10756,24 @@
         <w:tc>
           <w:tcPr/>
           <w:p>
-            <w:pPr>
-              <w:spacing w:after="0" w:before="0" w:lineRule="auto"/>
-              <w:rPr/>
-            </w:pPr>
-            <w:r>
-              <w:rPr>
-                <w:rtl w:val="0"/>
-              </w:rPr>
-            </w:r>
-          </w:p>
-        </w:tc>
-        <w:tc>
-          <w:tcPr/>
-          <w:p>
-            <w:pPr>
-              <w:spacing w:after="0" w:before="0" w:lineRule="auto"/>
-              <w:rPr/>
-            </w:pPr>
-            <w:r>
-              <w:rPr>
-                <w:rtl w:val="0"/>
-              </w:rPr>
-            </w:r>
-          </w:p>
-        </w:tc>
-        <w:tc>
-          <w:tcPr/>
-          <w:p>
-            <w:pPr>
-              <w:spacing w:after="0" w:before="0" w:lineRule="auto"/>
-              <w:rPr/>
-            </w:pPr>
-            <w:r>
-              <w:rPr>
-                <w:rtl w:val="0"/>
-              </w:rPr>
+            <w:r>
+              <w:t>Halaman menulis status 404.</w:t>
+            </w:r>
+          </w:p>
+        </w:tc>
+        <w:tc>
+          <w:tcPr/>
+          <w:p>
+            <w:r>
+              <w:t>Path API tidak ada.</w:t>
+            </w:r>
+          </w:p>
+        </w:tc>
+        <w:tc>
+          <w:tcPr/>
+          <w:p>
+            <w:r>
+              <w:t>Periksa response.ok sebelum json().</w:t>
             </w:r>
           </w:p>
         </w:tc>
@@ -10804,42 +10786,24 @@
         <w:tc>
           <w:tcPr/>
           <w:p>
-            <w:pPr>
-              <w:spacing w:after="0" w:before="0" w:lineRule="auto"/>
-              <w:rPr/>
-            </w:pPr>
-            <w:r>
-              <w:rPr>
-                <w:rtl w:val="0"/>
-              </w:rPr>
-            </w:r>
-          </w:p>
-        </w:tc>
-        <w:tc>
-          <w:tcPr/>
-          <w:p>
-            <w:pPr>
-              <w:spacing w:after="0" w:before="0" w:lineRule="auto"/>
-              <w:rPr/>
-            </w:pPr>
-            <w:r>
-              <w:rPr>
-                <w:rtl w:val="0"/>
-              </w:rPr>
-            </w:r>
-          </w:p>
-        </w:tc>
-        <w:tc>
-          <w:tcPr/>
-          <w:p>
-            <w:pPr>
-              <w:spacing w:after="0" w:before="0" w:lineRule="auto"/>
-              <w:rPr/>
-            </w:pPr>
-            <w:r>
-              <w:rPr>
-                <w:rtl w:val="0"/>
-              </w:rPr>
+            <w:r>
+              <w:t>Respons API bukan JSON.</w:t>
+            </w:r>
+          </w:p>
+        </w:tc>
+        <w:tc>
+          <w:tcPr/>
+          <w:p>
+            <w:r>
+              <w:t>Body HTML, Content-Type text/html.</w:t>
+            </w:r>
+          </w:p>
+        </w:tc>
+        <w:tc>
+          <w:tcPr/>
+          <w:p>
+            <w:r>
+              <w:t>Periksa Content-Type; tampilkan galat.</w:t>
             </w:r>
           </w:p>
         </w:tc>
@@ -10852,42 +10816,24 @@
         <w:tc>
           <w:tcPr/>
           <w:p>
-            <w:pPr>
-              <w:spacing w:after="0" w:before="0" w:lineRule="auto"/>
-              <w:rPr/>
-            </w:pPr>
-            <w:r>
-              <w:rPr>
-                <w:rtl w:val="0"/>
-              </w:rPr>
-            </w:r>
-          </w:p>
-        </w:tc>
-        <w:tc>
-          <w:tcPr/>
-          <w:p>
-            <w:pPr>
-              <w:spacing w:after="0" w:before="0" w:lineRule="auto"/>
-              <w:rPr/>
-            </w:pPr>
-            <w:r>
-              <w:rPr>
-                <w:rtl w:val="0"/>
-              </w:rPr>
-            </w:r>
-          </w:p>
-        </w:tc>
-        <w:tc>
-          <w:tcPr/>
-          <w:p>
-            <w:pPr>
-              <w:spacing w:after="0" w:before="0" w:lineRule="auto"/>
-              <w:rPr/>
-            </w:pPr>
-            <w:r>
-              <w:rPr>
-                <w:rtl w:val="0"/>
-              </w:rPr>
+            <w:r>
+              <w:t>Belum ada catatan dari API.</w:t>
+            </w:r>
+          </w:p>
+        </w:tc>
+        <w:tc>
+          <w:tcPr/>
+          <w:p>
+            <w:r>
+              <w:t>Array JSON valid tetapi kosong.</w:t>
+            </w:r>
+          </w:p>
+        </w:tc>
+        <w:tc>
+          <w:tcPr/>
+          <w:p>
+            <w:r>
+              <w:t>renderCatatan([]) menampilkan pesan.</w:t>
             </w:r>
           </w:p>
         </w:tc>

</xml_diff>

<commit_message>
P10: pemeriksaan akhir dan bukti empat keadaan
</commit_message>
<xml_diff>
--- a/worksheet-p10/WORKSHEET-P10.docx
+++ b/worksheet-p10/WORKSHEET-P10.docx
@@ -11564,26 +11564,8 @@
         <w:tc>
           <w:tcPr/>
           <w:p>
-            <w:pPr>
-              <w:spacing w:after="0" w:before="0" w:lineRule="auto"/>
-              <w:rPr/>
-            </w:pPr>
-            <w:r>
-              <w:rPr>
-                <w:rFonts w:ascii="Carlito" w:cs="Carlito" w:eastAsia="Carlito" w:hAnsi="Carlito"/>
-                <w:b w:val="0"/>
-                <w:bCs w:val="0"/>
-                <w:color w:val="1a1a2e"/>
-                <w:sz w:val="18"/>
-                <w:szCs w:val="18"/>
-                <w:rtl w:val="0"/>
-              </w:rPr>
-              <w:t xml:space="preserve">☐</w:t>
-            </w:r>
-            <w:r>
-              <w:rPr>
-                <w:rtl w:val="0"/>
-              </w:rPr>
+            <w:r>
+              <w:t>☑</w:t>
             </w:r>
           </w:p>
         </w:tc>
@@ -11648,26 +11630,8 @@
         <w:tc>
           <w:tcPr/>
           <w:p>
-            <w:pPr>
-              <w:spacing w:after="0" w:before="0" w:lineRule="auto"/>
-              <w:rPr/>
-            </w:pPr>
-            <w:r>
-              <w:rPr>
-                <w:rFonts w:ascii="Carlito" w:cs="Carlito" w:eastAsia="Carlito" w:hAnsi="Carlito"/>
-                <w:b w:val="0"/>
-                <w:bCs w:val="0"/>
-                <w:color w:val="1a1a2e"/>
-                <w:sz w:val="18"/>
-                <w:szCs w:val="18"/>
-                <w:rtl w:val="0"/>
-              </w:rPr>
-              <w:t xml:space="preserve">☐</w:t>
-            </w:r>
-            <w:r>
-              <w:rPr>
-                <w:rtl w:val="0"/>
-              </w:rPr>
+            <w:r>
+              <w:t>☑</w:t>
             </w:r>
           </w:p>
         </w:tc>
@@ -11732,26 +11696,8 @@
         <w:tc>
           <w:tcPr/>
           <w:p>
-            <w:pPr>
-              <w:spacing w:after="0" w:before="0" w:lineRule="auto"/>
-              <w:rPr/>
-            </w:pPr>
-            <w:r>
-              <w:rPr>
-                <w:rFonts w:ascii="Carlito" w:cs="Carlito" w:eastAsia="Carlito" w:hAnsi="Carlito"/>
-                <w:b w:val="0"/>
-                <w:bCs w:val="0"/>
-                <w:color w:val="1a1a2e"/>
-                <w:sz w:val="18"/>
-                <w:szCs w:val="18"/>
-                <w:rtl w:val="0"/>
-              </w:rPr>
-              <w:t xml:space="preserve">☐</w:t>
-            </w:r>
-            <w:r>
-              <w:rPr>
-                <w:rtl w:val="0"/>
-              </w:rPr>
+            <w:r>
+              <w:t>☑</w:t>
             </w:r>
           </w:p>
         </w:tc>
@@ -11816,26 +11762,8 @@
         <w:tc>
           <w:tcPr/>
           <w:p>
-            <w:pPr>
-              <w:spacing w:after="0" w:before="0" w:lineRule="auto"/>
-              <w:rPr/>
-            </w:pPr>
-            <w:r>
-              <w:rPr>
-                <w:rFonts w:ascii="Carlito" w:cs="Carlito" w:eastAsia="Carlito" w:hAnsi="Carlito"/>
-                <w:b w:val="0"/>
-                <w:bCs w:val="0"/>
-                <w:color w:val="1a1a2e"/>
-                <w:sz w:val="18"/>
-                <w:szCs w:val="18"/>
-                <w:rtl w:val="0"/>
-              </w:rPr>
-              <w:t xml:space="preserve">☐</w:t>
-            </w:r>
-            <w:r>
-              <w:rPr>
-                <w:rtl w:val="0"/>
-              </w:rPr>
+            <w:r>
+              <w:t>☑</w:t>
             </w:r>
           </w:p>
         </w:tc>
@@ -11900,26 +11828,8 @@
         <w:tc>
           <w:tcPr/>
           <w:p>
-            <w:pPr>
-              <w:spacing w:after="0" w:before="0" w:lineRule="auto"/>
-              <w:rPr/>
-            </w:pPr>
-            <w:r>
-              <w:rPr>
-                <w:rFonts w:ascii="Carlito" w:cs="Carlito" w:eastAsia="Carlito" w:hAnsi="Carlito"/>
-                <w:b w:val="0"/>
-                <w:bCs w:val="0"/>
-                <w:color w:val="1a1a2e"/>
-                <w:sz w:val="18"/>
-                <w:szCs w:val="18"/>
-                <w:rtl w:val="0"/>
-              </w:rPr>
-              <w:t xml:space="preserve">☐</w:t>
-            </w:r>
-            <w:r>
-              <w:rPr>
-                <w:rtl w:val="0"/>
-              </w:rPr>
+            <w:r>
+              <w:t>☑</w:t>
             </w:r>
           </w:p>
         </w:tc>
@@ -11984,26 +11894,8 @@
         <w:tc>
           <w:tcPr/>
           <w:p>
-            <w:pPr>
-              <w:spacing w:after="0" w:before="0" w:lineRule="auto"/>
-              <w:rPr/>
-            </w:pPr>
-            <w:r>
-              <w:rPr>
-                <w:rFonts w:ascii="Carlito" w:cs="Carlito" w:eastAsia="Carlito" w:hAnsi="Carlito"/>
-                <w:b w:val="0"/>
-                <w:bCs w:val="0"/>
-                <w:color w:val="1a1a2e"/>
-                <w:sz w:val="18"/>
-                <w:szCs w:val="18"/>
-                <w:rtl w:val="0"/>
-              </w:rPr>
-              <w:t xml:space="preserve">☐</w:t>
-            </w:r>
-            <w:r>
-              <w:rPr>
-                <w:rtl w:val="0"/>
-              </w:rPr>
+            <w:r>
+              <w:t>☑</w:t>
             </w:r>
           </w:p>
         </w:tc>
@@ -12068,26 +11960,8 @@
         <w:tc>
           <w:tcPr/>
           <w:p>
-            <w:pPr>
-              <w:spacing w:after="0" w:before="0" w:lineRule="auto"/>
-              <w:rPr/>
-            </w:pPr>
-            <w:r>
-              <w:rPr>
-                <w:rFonts w:ascii="Carlito" w:cs="Carlito" w:eastAsia="Carlito" w:hAnsi="Carlito"/>
-                <w:b w:val="0"/>
-                <w:bCs w:val="0"/>
-                <w:color w:val="1a1a2e"/>
-                <w:sz w:val="18"/>
-                <w:szCs w:val="18"/>
-                <w:rtl w:val="0"/>
-              </w:rPr>
-              <w:t xml:space="preserve">☐</w:t>
-            </w:r>
-            <w:r>
-              <w:rPr>
-                <w:rtl w:val="0"/>
-              </w:rPr>
+            <w:r>
+              <w:t>☑</w:t>
             </w:r>
           </w:p>
         </w:tc>
@@ -12152,26 +12026,8 @@
         <w:tc>
           <w:tcPr/>
           <w:p>
-            <w:pPr>
-              <w:spacing w:after="0" w:before="0" w:lineRule="auto"/>
-              <w:rPr/>
-            </w:pPr>
-            <w:r>
-              <w:rPr>
-                <w:rFonts w:ascii="Carlito" w:cs="Carlito" w:eastAsia="Carlito" w:hAnsi="Carlito"/>
-                <w:b w:val="0"/>
-                <w:bCs w:val="0"/>
-                <w:color w:val="1a1a2e"/>
-                <w:sz w:val="18"/>
-                <w:szCs w:val="18"/>
-                <w:rtl w:val="0"/>
-              </w:rPr>
-              <w:t xml:space="preserve">☐</w:t>
-            </w:r>
-            <w:r>
-              <w:rPr>
-                <w:rtl w:val="0"/>
-              </w:rPr>
+            <w:r>
+              <w:t>☑</w:t>
             </w:r>
           </w:p>
         </w:tc>
@@ -12236,26 +12092,8 @@
         <w:tc>
           <w:tcPr/>
           <w:p>
-            <w:pPr>
-              <w:spacing w:after="0" w:before="0" w:lineRule="auto"/>
-              <w:rPr/>
-            </w:pPr>
-            <w:r>
-              <w:rPr>
-                <w:rFonts w:ascii="Carlito" w:cs="Carlito" w:eastAsia="Carlito" w:hAnsi="Carlito"/>
-                <w:b w:val="0"/>
-                <w:bCs w:val="0"/>
-                <w:color w:val="1a1a2e"/>
-                <w:sz w:val="18"/>
-                <w:szCs w:val="18"/>
-                <w:rtl w:val="0"/>
-              </w:rPr>
-              <w:t xml:space="preserve">☐</w:t>
-            </w:r>
-            <w:r>
-              <w:rPr>
-                <w:rtl w:val="0"/>
-              </w:rPr>
+            <w:r>
+              <w:t>☑</w:t>
             </w:r>
           </w:p>
         </w:tc>
@@ -12320,26 +12158,8 @@
         <w:tc>
           <w:tcPr/>
           <w:p>
-            <w:pPr>
-              <w:spacing w:after="0" w:before="0" w:lineRule="auto"/>
-              <w:rPr/>
-            </w:pPr>
-            <w:r>
-              <w:rPr>
-                <w:rFonts w:ascii="Carlito" w:cs="Carlito" w:eastAsia="Carlito" w:hAnsi="Carlito"/>
-                <w:b w:val="0"/>
-                <w:bCs w:val="0"/>
-                <w:color w:val="1a1a2e"/>
-                <w:sz w:val="18"/>
-                <w:szCs w:val="18"/>
-                <w:rtl w:val="0"/>
-              </w:rPr>
-              <w:t xml:space="preserve">☐</w:t>
-            </w:r>
-            <w:r>
-              <w:rPr>
-                <w:rtl w:val="0"/>
-              </w:rPr>
+            <w:r>
+              <w:t>☐</w:t>
             </w:r>
           </w:p>
         </w:tc>
@@ -12533,28 +12353,16 @@
         <w:tc>
           <w:tcPr/>
           <w:p>
-            <w:pPr>
-              <w:spacing w:after="0" w:before="0" w:lineRule="auto"/>
-              <w:rPr/>
-            </w:pPr>
-            <w:r>
-              <w:rPr>
-                <w:rtl w:val="0"/>
-              </w:rPr>
-            </w:r>
-          </w:p>
-        </w:tc>
-        <w:tc>
-          <w:tcPr/>
-          <w:p>
-            <w:pPr>
-              <w:spacing w:after="0" w:before="0" w:lineRule="auto"/>
-              <w:rPr/>
-            </w:pPr>
-            <w:r>
-              <w:rPr>
-                <w:rtl w:val="0"/>
-              </w:rPr>
+            <w:r>
+              <w:t>evidence/f-success.jpg</w:t>
+            </w:r>
+          </w:p>
+        </w:tc>
+        <w:tc>
+          <w:tcPr/>
+          <w:p>
+            <w:r>
+              <w:t>4 kartu; status berhasil.</w:t>
             </w:r>
           </w:p>
         </w:tc>
@@ -12593,28 +12401,16 @@
         <w:tc>
           <w:tcPr/>
           <w:p>
-            <w:pPr>
-              <w:spacing w:after="0" w:before="0" w:lineRule="auto"/>
-              <w:rPr/>
-            </w:pPr>
-            <w:r>
-              <w:rPr>
-                <w:rtl w:val="0"/>
-              </w:rPr>
-            </w:r>
-          </w:p>
-        </w:tc>
-        <w:tc>
-          <w:tcPr/>
-          <w:p>
-            <w:pPr>
-              <w:spacing w:after="0" w:before="0" w:lineRule="auto"/>
-              <w:rPr/>
-            </w:pPr>
-            <w:r>
-              <w:rPr>
-                <w:rtl w:val="0"/>
-              </w:rPr>
+            <w:r>
+              <w:t>evidence/f-failure.jpg</w:t>
+            </w:r>
+          </w:p>
+        </w:tc>
+        <w:tc>
+          <w:tcPr/>
+          <w:p>
+            <w:r>
+              <w:t>Domain .invalid; galat tampil.</w:t>
             </w:r>
           </w:p>
         </w:tc>
@@ -12653,28 +12449,16 @@
         <w:tc>
           <w:tcPr/>
           <w:p>
-            <w:pPr>
-              <w:spacing w:after="0" w:before="0" w:lineRule="auto"/>
-              <w:rPr/>
-            </w:pPr>
-            <w:r>
-              <w:rPr>
-                <w:rtl w:val="0"/>
-              </w:rPr>
-            </w:r>
-          </w:p>
-        </w:tc>
-        <w:tc>
-          <w:tcPr/>
-          <w:p>
-            <w:pPr>
-              <w:spacing w:after="0" w:before="0" w:lineRule="auto"/>
-              <w:rPr/>
-            </w:pPr>
-            <w:r>
-              <w:rPr>
-                <w:rtl w:val="0"/>
-              </w:rPr>
+            <w:r>
+              <w:t>evidence/f-empty.jpg; f-loading.jpg</w:t>
+            </w:r>
+          </w:p>
+        </w:tc>
+        <w:tc>
+          <w:tcPr/>
+          <w:p>
+            <w:r>
+              <w:t>Kosong dan memuat terekam.</w:t>
             </w:r>
           </w:p>
         </w:tc>
@@ -12775,26 +12559,8 @@
             <w:shd w:fill="f0f4ff" w:val="clear"/>
           </w:tcPr>
           <w:p>
-            <w:pPr>
-              <w:spacing w:after="0" w:before="0" w:lineRule="auto"/>
-              <w:rPr/>
-            </w:pPr>
-            <w:r>
-              <w:rPr>
-                <w:rFonts w:ascii="Carlito" w:cs="Carlito" w:eastAsia="Carlito" w:hAnsi="Carlito"/>
-                <w:b w:val="0"/>
-                <w:bCs w:val="0"/>
-                <w:color w:val="1a1a2e"/>
-                <w:sz w:val="20"/>
-                <w:szCs w:val="20"/>
-                <w:rtl w:val="0"/>
-              </w:rPr>
-              <w:t xml:space="preserve">Potongan kode:                                                                            Dipakai pada:</w:t>
-            </w:r>
-            <w:r>
-              <w:rPr>
-                <w:rtl w:val="0"/>
-              </w:rPr>
+            <w:r>
+              <w:t>Kode: if (!response.ok) throw new Error("status " + response.status);  Dipakai pada: fetchNews() di js/api.js.</w:t>
             </w:r>
           </w:p>
         </w:tc>
@@ -13044,28 +12810,16 @@
         <w:tc>
           <w:tcPr/>
           <w:p>
-            <w:pPr>
-              <w:spacing w:after="0" w:before="0" w:lineRule="auto"/>
-              <w:rPr/>
-            </w:pPr>
-            <w:r>
-              <w:rPr>
-                <w:rtl w:val="0"/>
-              </w:rPr>
-            </w:r>
-          </w:p>
-        </w:tc>
-        <w:tc>
-          <w:tcPr/>
-          <w:p>
-            <w:pPr>
-              <w:spacing w:after="0" w:before="0" w:lineRule="auto"/>
-              <w:rPr/>
-            </w:pPr>
-            <w:r>
-              <w:rPr>
-                <w:rtl w:val="0"/>
-              </w:rPr>
+            <w:r>
+              <w:t>22/25</w:t>
+            </w:r>
+          </w:p>
+        </w:tc>
+        <w:tc>
+          <w:tcPr/>
+          <w:p>
+            <w:r>
+              <w:t>URL tunggal dan pemeriksaan status.</w:t>
             </w:r>
           </w:p>
         </w:tc>
@@ -13130,28 +12884,16 @@
         <w:tc>
           <w:tcPr/>
           <w:p>
-            <w:pPr>
-              <w:spacing w:after="0" w:before="0" w:lineRule="auto"/>
-              <w:rPr/>
-            </w:pPr>
-            <w:r>
-              <w:rPr>
-                <w:rtl w:val="0"/>
-              </w:rPr>
-            </w:r>
-          </w:p>
-        </w:tc>
-        <w:tc>
-          <w:tcPr/>
-          <w:p>
-            <w:pPr>
-              <w:spacing w:after="0" w:before="0" w:lineRule="auto"/>
-              <w:rPr/>
-            </w:pPr>
-            <w:r>
-              <w:rPr>
-                <w:rtl w:val="0"/>
-              </w:rPr>
+            <w:r>
+              <w:t>22/25</w:t>
+            </w:r>
+          </w:p>
+        </w:tc>
+        <w:tc>
+          <w:tcPr/>
+          <w:p>
+            <w:r>
+              <w:t>JSON dibaca di api.js; kartu di app.js.</w:t>
             </w:r>
           </w:p>
         </w:tc>
@@ -13216,28 +12958,16 @@
         <w:tc>
           <w:tcPr/>
           <w:p>
-            <w:pPr>
-              <w:spacing w:after="0" w:before="0" w:lineRule="auto"/>
-              <w:rPr/>
-            </w:pPr>
-            <w:r>
-              <w:rPr>
-                <w:rtl w:val="0"/>
-              </w:rPr>
-            </w:r>
-          </w:p>
-        </w:tc>
-        <w:tc>
-          <w:tcPr/>
-          <w:p>
-            <w:pPr>
-              <w:spacing w:after="0" w:before="0" w:lineRule="auto"/>
-              <w:rPr/>
-            </w:pPr>
-            <w:r>
-              <w:rPr>
-                <w:rtl w:val="0"/>
-              </w:rPr>
+            <w:r>
+              <w:t>20/20</w:t>
+            </w:r>
+          </w:p>
+        </w:tc>
+        <w:tc>
+          <w:tcPr/>
+          <w:p>
+            <w:r>
+              <w:t>Empat keadaan punya bukti visual.</w:t>
             </w:r>
           </w:p>
         </w:tc>
@@ -13302,28 +13032,16 @@
         <w:tc>
           <w:tcPr/>
           <w:p>
-            <w:pPr>
-              <w:spacing w:after="0" w:before="0" w:lineRule="auto"/>
-              <w:rPr/>
-            </w:pPr>
-            <w:r>
-              <w:rPr>
-                <w:rtl w:val="0"/>
-              </w:rPr>
-            </w:r>
-          </w:p>
-        </w:tc>
-        <w:tc>
-          <w:tcPr/>
-          <w:p>
-            <w:pPr>
-              <w:spacing w:after="0" w:before="0" w:lineRule="auto"/>
-              <w:rPr/>
-            </w:pPr>
-            <w:r>
-              <w:rPr>
-                <w:rtl w:val="0"/>
-              </w:rPr>
+            <w:r>
+              <w:t>18/20</w:t>
+            </w:r>
+          </w:p>
+        </w:tc>
+        <w:tc>
+          <w:tcPr/>
+          <w:p>
+            <w:r>
+              <w:t>404, non-JSON, dan domain gagal diuji.</w:t>
             </w:r>
           </w:p>
         </w:tc>
@@ -13388,28 +13106,16 @@
         <w:tc>
           <w:tcPr/>
           <w:p>
-            <w:pPr>
-              <w:spacing w:after="0" w:before="0" w:lineRule="auto"/>
-              <w:rPr/>
-            </w:pPr>
-            <w:r>
-              <w:rPr>
-                <w:rtl w:val="0"/>
-              </w:rPr>
-            </w:r>
-          </w:p>
-        </w:tc>
-        <w:tc>
-          <w:tcPr/>
-          <w:p>
-            <w:pPr>
-              <w:spacing w:after="0" w:before="0" w:lineRule="auto"/>
-              <w:rPr/>
-            </w:pPr>
-            <w:r>
-              <w:rPr>
-                <w:rtl w:val="0"/>
-              </w:rPr>
+            <w:r>
+              <w:t>8/10</w:t>
+            </w:r>
+          </w:p>
+        </w:tc>
+        <w:tc>
+          <w:tcPr/>
+          <w:p>
+            <w:r>
+              <w:t>README dan bukti ada; orisinalitas perlu konfirmasi.</w:t>
             </w:r>
           </w:p>
         </w:tc>
@@ -13474,28 +13180,16 @@
         <w:tc>
           <w:tcPr/>
           <w:p>
-            <w:pPr>
-              <w:spacing w:after="0" w:before="0" w:lineRule="auto"/>
-              <w:rPr/>
-            </w:pPr>
-            <w:r>
-              <w:rPr>
-                <w:rtl w:val="0"/>
-              </w:rPr>
-            </w:r>
-          </w:p>
-        </w:tc>
-        <w:tc>
-          <w:tcPr/>
-          <w:p>
-            <w:pPr>
-              <w:spacing w:after="0" w:before="0" w:lineRule="auto"/>
-              <w:rPr/>
-            </w:pPr>
-            <w:r>
-              <w:rPr>
-                <w:rtl w:val="0"/>
-              </w:rPr>
+            <w:r>
+              <w:t>90/100</w:t>
+            </w:r>
+          </w:p>
+        </w:tc>
+        <w:tc>
+          <w:tcPr/>
+          <w:p>
+            <w:r>
+              <w:t>Perkiraan penilaian diri.</w:t>
             </w:r>
           </w:p>
         </w:tc>
@@ -13684,14 +13378,8 @@
         <w:tc>
           <w:tcPr/>
           <w:p>
-            <w:pPr>
-              <w:spacing w:after="0" w:before="0" w:lineRule="auto"/>
-              <w:rPr/>
-            </w:pPr>
-            <w:r>
-              <w:rPr>
-                <w:rtl w:val="0"/>
-              </w:rPr>
+            <w:r>
+              <w:t>404 tetap menghasilkan Response; fetch gagal otomatis hanya untuk galat jaringan.</w:t>
             </w:r>
           </w:p>
         </w:tc>
@@ -13730,14 +13418,8 @@
         <w:tc>
           <w:tcPr/>
           <w:p>
-            <w:pPr>
-              <w:spacing w:after="0" w:before="0" w:lineRule="auto"/>
-              <w:rPr/>
-            </w:pPr>
-            <w:r>
-              <w:rPr>
-                <w:rtl w:val="0"/>
-              </w:rPr>
+            <w:r>
+              <w:t>Di fungsi async atau tingkat atas modul ES; tidak di fungsi biasa atau skrip klasik.</w:t>
             </w:r>
           </w:p>
         </w:tc>
@@ -13776,14 +13458,8 @@
         <w:tc>
           <w:tcPr/>
           <w:p>
-            <w:pPr>
-              <w:spacing w:after="0" w:before="0" w:lineRule="auto"/>
-              <w:rPr/>
-            </w:pPr>
-            <w:r>
-              <w:rPr>
-                <w:rtl w:val="0"/>
-              </w:rPr>
+            <w:r>
+              <w:t>Keadaan kosong; renderCatatan([]) menampilkan pesan, bukan halaman putih.</w:t>
             </w:r>
           </w:p>
         </w:tc>
@@ -13882,14 +13558,8 @@
         <w:tc>
           <w:tcPr/>
           <w:p>
-            <w:pPr>
-              <w:spacing w:after="0" w:before="0" w:lineRule="auto"/>
-              <w:rPr/>
-            </w:pPr>
-            <w:r>
-              <w:rPr>
-                <w:rtl w:val="0"/>
-              </w:rPr>
+            <w:r>
+              <w:t>Membedakan galat jaringan, status HTTP, respons bukan JSON, dan data kosong.</w:t>
             </w:r>
           </w:p>
         </w:tc>
@@ -13940,11 +13610,7 @@
         <w:spacing w:after="0" w:before="0" w:line="40" w:lineRule="auto"/>
         <w:rPr/>
       </w:pPr>
-      <w:r>
-        <w:rPr>
-          <w:rtl w:val="0"/>
-        </w:rPr>
-      </w:r>
+      <w:r/>
     </w:p>
     <w:p>
       <w:pPr>
@@ -14003,14 +13669,8 @@
         <w:tc>
           <w:tcPr/>
           <w:p>
-            <w:pPr>
-              <w:spacing w:after="0" w:before="0" w:lineRule="auto"/>
-              <w:rPr/>
-            </w:pPr>
-            <w:r>
-              <w:rPr>
-                <w:rtl w:val="0"/>
-              </w:rPr>
+            <w:r>
+              <w:t>Cara menguji permintaan API tanpa mengubah URL di kode, misalnya dengan mock.</w:t>
             </w:r>
           </w:p>
         </w:tc>
@@ -14061,11 +13721,7 @@
         <w:spacing w:after="0" w:before="0" w:line="40" w:lineRule="auto"/>
         <w:rPr/>
       </w:pPr>
-      <w:r>
-        <w:rPr>
-          <w:rtl w:val="0"/>
-        </w:rPr>
-      </w:r>
+      <w:r/>
     </w:p>
     <w:p>
       <w:pPr>

</xml_diff>